<commit_message>
docx: unescape hyphens and parens, lock URL survival into the fixture
Real-document QA (a course syllabus) showed hyphens and parens still
escape-noised (917\-620\-3998, \(8/25\)). Both now unescape mid-line;
a line-leading hyphen keeps its escape (a dash paragraph must not become
a bullet), mirroring the digits-period list guard. Parens cannot form
accidental links because brackets stay escaped; underscore escapes stay
too (structural for emphasis).

Hyperlinks were the QA focus and survived intact as [text](url) with
full targets - the fixture now contains an external hyperlink plus
mid-line hyphens/parens so URL survival and the new unescapes are
regression-locked.

Co-Authored-By: Claude Fable 5 <noreply@anthropic.com>
</commit_message>
<xml_diff>
--- a/test/fixtures/tiny.docx
+++ b/test/fixtures/tiny.docx
@@ -1,6 +1,6 @@
 
 <file path=word/document.xml><?xml version="1.0" encoding="utf-8"?>
-<w:document xmlns:w="http://schemas.openxmlformats.org/wordprocessingml/2006/main">
+<w:document xmlns:w="http://schemas.openxmlformats.org/wordprocessingml/2006/main" xmlns:r="http://schemas.openxmlformats.org/officeDocument/2006/relationships">
   <w:body>
     <w:p>
       <w:pPr>
@@ -34,6 +34,16 @@
         <w:t xml:space="preserve"> text!</w:t>
       </w:r>
     </w:p>
+    <w:p>
+      <w:r>
+        <w:t xml:space="preserve">Mon 11a-12:30p (online): </w:t>
+      </w:r>
+      <w:hyperlink r:id="rId2">
+        <w:r>
+          <w:t>class folder</w:t>
+        </w:r>
+      </w:hyperlink>
+    </w:p>
   </w:body>
 </w:document>
 </file>

</xml_diff>

<commit_message>
docx: move whitespace out of emphasis markers by pairing delimiters
mammoth keeps a run trailing/leading space inside the emphasis markers
(__student work __folder, *tab *Zawarkand); CommonMark will not close a
span next to a space, so these render as literal underscores/asterisks -
the inconsistent emphasis a reader sees.

Implemented as a sequential delimiter-pairing scan, not regexes: a regex
hunting delimiter-spaces-delimiter pairs one span close with the next
span open (__label: __[__url__]) and can corrupt two-span lines
(__a__ x __b__). Pairing is unambiguous because mammoth escapes literal
* and _ in text, so every unescaped delimiter is structural. Unpaired
and whitespace-only delimiters are left verbatim.

Fixture gains a bold-label-then-text paragraph; tests cover the
label+link pairing, the two-span no-merge case, and unpaired/empty
delimiters.

Co-Authored-By: Claude Fable 5 <noreply@anthropic.com>
</commit_message>
<xml_diff>
--- a/test/fixtures/tiny.docx
+++ b/test/fixtures/tiny.docx
@@ -44,6 +44,17 @@
         </w:r>
       </w:hyperlink>
     </w:p>
+    <w:p>
+      <w:r>
+        <w:rPr>
+          <w:b/>
+        </w:rPr>
+        <w:t xml:space="preserve">Note: </w:t>
+      </w:r>
+      <w:r>
+        <w:t>bring an oud.</w:t>
+      </w:r>
+    </w:p>
   </w:body>
 </w:document>
 </file>

</xml_diff>